<commit_message>
fix(quick_report): hoist Word COM session and fix date formatting
Per-iteration COM lifecycle (Dispatch->Quit xN) caused zombie
WINWORD.EXE processes -- Dispatch connected to dying processes,
returning broken COM objects that crashed on Documents.Add().
Hoisting to a single session above the batch loop eliminates the
race condition entirely.

- Hoist Word.Application above batch loop, quit in top-level finally
- Fail-fast if COM init fails (batch requires Word)
- Remove composer's own_word fallback (word_app now required)
- Early exit for 0 packages to skip needless Word launch
- gc.collect() after Quit() to release COM proxy references
- Standardize date formats: DD MMM YYYY (front page), DD/MM/YYYY (CBM)
- Remove dead pythoncom/win32com imports from composer
</commit_message>
<xml_diff>
--- a/templates/QUICK REPORT/1. FRONT PAGE TEMPLATE IR US TEV BOX Jinja2 updated.docx
+++ b/templates/QUICK REPORT/1. FRONT PAGE TEMPLATE IR US TEV BOX Jinja2 updated.docx
@@ -166,7 +166,7 @@
                 <w:lang w:eastAsia="en-MY"/>
               </w:rPr>
               <w:drawing>
-                <wp:inline distT="0" distB="0" distL="0" distR="0" wp14:anchorId="7D93C327" wp14:editId="5A87A9E2">
+                <wp:inline distT="0" distB="0" distL="0" distR="0" wp14:anchorId="7D93C327" wp14:editId="1C997BC4">
                   <wp:extent cx="2286000" cy="649224"/>
                   <wp:effectExtent l="0" t="0" r="0" b="0"/>
                   <wp:docPr id="4" name="Picture 4" descr="D:\Work Documents\Template\Logo\New EET Logo Final _Color.png"/>
@@ -310,7 +310,6 @@
         </w:rPr>
         <w:t xml:space="preserve">{{ </w:t>
       </w:r>
-      <w:proofErr w:type="spellStart"/>
       <w:r>
         <w:rPr>
           <w:rFonts w:cstheme="minorHAnsi"/>
@@ -320,7 +319,6 @@
         </w:rPr>
         <w:t>substation.state</w:t>
       </w:r>
-      <w:proofErr w:type="spellEnd"/>
       <w:r>
         <w:rPr>
           <w:rFonts w:cstheme="minorHAnsi"/>
@@ -369,7 +367,6 @@
         </w:rPr>
         <w:t xml:space="preserve">{{ </w:t>
       </w:r>
-      <w:proofErr w:type="spellStart"/>
       <w:r>
         <w:rPr>
           <w:rFonts w:cstheme="minorHAnsi"/>
@@ -379,7 +376,6 @@
         </w:rPr>
         <w:t>substation.state</w:t>
       </w:r>
-      <w:proofErr w:type="spellEnd"/>
       <w:r>
         <w:rPr>
           <w:rFonts w:cstheme="minorHAnsi"/>
@@ -471,7 +467,6 @@
               </w:rPr>
               <w:t xml:space="preserve">{{ </w:t>
             </w:r>
-            <w:proofErr w:type="spellStart"/>
             <w:r>
               <w:rPr>
                 <w:rFonts w:cstheme="minorHAnsi"/>
@@ -482,14 +477,7 @@
               <w:rPr>
                 <w:rFonts w:cstheme="minorHAnsi"/>
               </w:rPr>
-              <w:t>fl_erms</w:t>
-            </w:r>
-            <w:proofErr w:type="spellEnd"/>
-            <w:r>
-              <w:rPr>
-                <w:rFonts w:cstheme="minorHAnsi"/>
-              </w:rPr>
-              <w:t xml:space="preserve"> }}</w:t>
+              <w:t>fl_erms }}</w:t>
             </w:r>
           </w:p>
         </w:tc>
@@ -550,7 +538,6 @@
               </w:rPr>
               <w:t xml:space="preserve">{{ </w:t>
             </w:r>
-            <w:proofErr w:type="spellStart"/>
             <w:r>
               <w:rPr>
                 <w:rFonts w:cstheme="minorHAnsi"/>
@@ -569,7 +556,6 @@
               </w:rPr>
               <w:t>e</w:t>
             </w:r>
-            <w:proofErr w:type="spellEnd"/>
             <w:r>
               <w:rPr>
                 <w:rFonts w:cstheme="minorHAnsi"/>
@@ -635,14 +621,12 @@
               </w:rPr>
               <w:t xml:space="preserve">{{ </w:t>
             </w:r>
-            <w:proofErr w:type="spellStart"/>
             <w:r>
               <w:rPr>
                 <w:rFonts w:cstheme="minorHAnsi"/>
               </w:rPr>
               <w:t>substation.name_erms</w:t>
             </w:r>
-            <w:proofErr w:type="spellEnd"/>
             <w:r>
               <w:rPr>
                 <w:rFonts w:cstheme="minorHAnsi"/>
@@ -708,14 +692,12 @@
               </w:rPr>
               <w:t xml:space="preserve">{{ </w:t>
             </w:r>
-            <w:proofErr w:type="spellStart"/>
             <w:r>
               <w:rPr>
                 <w:rFonts w:cstheme="minorHAnsi"/>
               </w:rPr>
               <w:t>substation.name_site</w:t>
             </w:r>
-            <w:proofErr w:type="spellEnd"/>
             <w:r>
               <w:rPr>
                 <w:rFonts w:cstheme="minorHAnsi"/>
@@ -781,7 +763,6 @@
               </w:rPr>
               <w:t xml:space="preserve">{{ </w:t>
             </w:r>
-            <w:proofErr w:type="spellStart"/>
             <w:r>
               <w:rPr>
                 <w:rFonts w:cstheme="minorHAnsi"/>
@@ -800,7 +781,6 @@
               </w:rPr>
               <w:t>coordinate</w:t>
             </w:r>
-            <w:proofErr w:type="spellEnd"/>
             <w:r>
               <w:rPr>
                 <w:rFonts w:cstheme="minorHAnsi"/>
@@ -866,7 +846,6 @@
               </w:rPr>
               <w:t xml:space="preserve">{{ </w:t>
             </w:r>
-            <w:proofErr w:type="spellStart"/>
             <w:r>
               <w:rPr>
                 <w:rFonts w:cstheme="minorHAnsi"/>
@@ -877,14 +856,7 @@
               <w:rPr>
                 <w:rFonts w:cstheme="minorHAnsi"/>
               </w:rPr>
-              <w:t>ype</w:t>
-            </w:r>
-            <w:proofErr w:type="spellEnd"/>
-            <w:r>
-              <w:rPr>
-                <w:rFonts w:cstheme="minorHAnsi"/>
-              </w:rPr>
-              <w:t xml:space="preserve"> }}</w:t>
+              <w:t>ype }}</w:t>
             </w:r>
           </w:p>
         </w:tc>
@@ -945,14 +917,12 @@
               </w:rPr>
               <w:t xml:space="preserve">{{ </w:t>
             </w:r>
-            <w:proofErr w:type="spellStart"/>
             <w:r>
               <w:rPr>
                 <w:rFonts w:cstheme="minorHAnsi"/>
               </w:rPr>
               <w:t>substation.area</w:t>
             </w:r>
-            <w:proofErr w:type="spellEnd"/>
             <w:r>
               <w:rPr>
                 <w:rFonts w:cstheme="minorHAnsi"/>
@@ -1016,21 +986,7 @@
               <w:rPr>
                 <w:rFonts w:cstheme="minorHAnsi"/>
               </w:rPr>
-              <w:t xml:space="preserve">{{ </w:t>
-            </w:r>
-            <w:proofErr w:type="spellStart"/>
-            <w:r>
-              <w:rPr>
-                <w:rFonts w:cstheme="minorHAnsi"/>
-              </w:rPr>
-              <w:t>substation.state</w:t>
-            </w:r>
-            <w:proofErr w:type="spellEnd"/>
-            <w:r>
-              <w:rPr>
-                <w:rFonts w:cstheme="minorHAnsi"/>
-              </w:rPr>
-              <w:t xml:space="preserve"> }}</w:t>
+              <w:t>{{ substation.state }}</w:t>
             </w:r>
           </w:p>
         </w:tc>
@@ -1098,21 +1054,7 @@
               <w:rPr>
                 <w:rFonts w:cstheme="minorHAnsi"/>
               </w:rPr>
-              <w:t xml:space="preserve">{{ </w:t>
-            </w:r>
-            <w:proofErr w:type="spellStart"/>
-            <w:r>
-              <w:rPr>
-                <w:rFonts w:cstheme="minorHAnsi"/>
-              </w:rPr>
-              <w:t>purchaseorder.number</w:t>
-            </w:r>
-            <w:proofErr w:type="spellEnd"/>
-            <w:r>
-              <w:rPr>
-                <w:rFonts w:cstheme="minorHAnsi"/>
-              </w:rPr>
-              <w:t xml:space="preserve"> }}</w:t>
+              <w:t>{{ purchaseorder.number }}</w:t>
             </w:r>
           </w:p>
         </w:tc>
@@ -1182,14 +1124,12 @@
               </w:rPr>
               <w:t xml:space="preserve">{{ </w:t>
             </w:r>
-            <w:proofErr w:type="spellStart"/>
             <w:r>
               <w:rPr>
                 <w:rFonts w:cstheme="minorHAnsi"/>
               </w:rPr>
               <w:t>substation.datefrontpage</w:t>
             </w:r>
-            <w:proofErr w:type="spellEnd"/>
             <w:r>
               <w:rPr>
                 <w:rFonts w:cstheme="minorHAnsi"/>
@@ -1711,6 +1651,7 @@
             <w:tcBorders>
               <w:bottom w:val="single" w:sz="4" w:space="0" w:color="auto"/>
             </w:tcBorders>
+            <w:vAlign w:val="center"/>
           </w:tcPr>
           <w:p>
             <w:pPr>
@@ -1732,6 +1673,7 @@
             <w:tcBorders>
               <w:bottom w:val="single" w:sz="4" w:space="0" w:color="auto"/>
             </w:tcBorders>
+            <w:vAlign w:val="center"/>
           </w:tcPr>
           <w:p>
             <w:pPr>
@@ -1753,6 +1695,7 @@
             <w:tcBorders>
               <w:bottom w:val="single" w:sz="4" w:space="0" w:color="auto"/>
             </w:tcBorders>
+            <w:vAlign w:val="center"/>
           </w:tcPr>
           <w:p>
             <w:pPr>
@@ -1829,6 +1772,7 @@
             <w:tcBorders>
               <w:bottom w:val="single" w:sz="4" w:space="0" w:color="auto"/>
             </w:tcBorders>
+            <w:vAlign w:val="center"/>
           </w:tcPr>
           <w:p>
             <w:pPr>
@@ -1850,18 +1794,19 @@
             <w:tcBorders>
               <w:bottom w:val="single" w:sz="4" w:space="0" w:color="auto"/>
             </w:tcBorders>
-          </w:tcPr>
-          <w:p>
-            <w:pPr>
-              <w:rPr>
-                <w:rFonts w:cstheme="minorHAnsi"/>
-              </w:rPr>
-            </w:pPr>
-            <w:r>
-              <w:rPr>
-                <w:rFonts w:cstheme="minorHAnsi"/>
-              </w:rPr>
-              <w:t xml:space="preserve">: </w:t>
+            <w:vAlign w:val="center"/>
+          </w:tcPr>
+          <w:p>
+            <w:pPr>
+              <w:rPr>
+                <w:rFonts w:cstheme="minorHAnsi"/>
+              </w:rPr>
+            </w:pPr>
+            <w:r>
+              <w:rPr>
+                <w:rFonts w:cstheme="minorHAnsi"/>
+              </w:rPr>
+              <w:t>:</w:t>
             </w:r>
           </w:p>
         </w:tc>
@@ -1871,6 +1816,7 @@
             <w:tcBorders>
               <w:bottom w:val="single" w:sz="4" w:space="0" w:color="auto"/>
             </w:tcBorders>
+            <w:vAlign w:val="center"/>
           </w:tcPr>
           <w:p>
             <w:pPr>
@@ -1958,6 +1904,7 @@
               <w:bottom w:val="single" w:sz="4" w:space="0" w:color="auto"/>
               <w:right w:val="single" w:sz="4" w:space="0" w:color="auto"/>
             </w:tcBorders>
+            <w:vAlign w:val="center"/>
           </w:tcPr>
           <w:p>
             <w:pPr>
@@ -1982,6 +1929,7 @@
               <w:bottom w:val="single" w:sz="4" w:space="0" w:color="auto"/>
               <w:right w:val="single" w:sz="4" w:space="0" w:color="auto"/>
             </w:tcBorders>
+            <w:vAlign w:val="center"/>
           </w:tcPr>
           <w:p>
             <w:pPr>
@@ -2006,6 +1954,7 @@
               <w:bottom w:val="single" w:sz="4" w:space="0" w:color="auto"/>
               <w:right w:val="single" w:sz="4" w:space="0" w:color="auto"/>
             </w:tcBorders>
+            <w:vAlign w:val="center"/>
           </w:tcPr>
           <w:p>
             <w:pPr>

</xml_diff>